<commit_message>
nmv 04 06 2026
</commit_message>
<xml_diff>
--- a/TS-Kramam/TS-5.6/TS 5.6 Malayalam Krama Paatam Corrections.docx
+++ b/TS-Kramam/TS-5.6/TS 5.6 Malayalam Krama Paatam Corrections.docx
@@ -872,7 +872,29 @@
                 <w:szCs w:val="40"/>
                 <w:lang w:val="it-IT" w:eastAsia="en-IN" w:bidi="ml-IN"/>
               </w:rPr>
-              <w:t>¥sõZõË—sõ - A</w:t>
+              <w:t xml:space="preserve">¥sõZõË—sõ </w:t>
+            </w:r>
+            <w:r>
+              <w:rPr>
+                <w:rFonts w:ascii="BRH Malayalam Extra" w:eastAsia="Times New Roman" w:hAnsi="BRH Malayalam Extra" w:cs="BRH Malayalam Extra"/>
+                <w:b/>
+                <w:bCs/>
+                <w:color w:val="000000"/>
+                <w:sz w:val="48"/>
+                <w:szCs w:val="48"/>
+                <w:lang w:val="it-IT" w:eastAsia="en-IN" w:bidi="ml-IN"/>
+              </w:rPr>
+              <w:t>-</w:t>
+            </w:r>
+            <w:r>
+              <w:rPr>
+                <w:rFonts w:ascii="BRH Malayalam Extra" w:eastAsia="Times New Roman" w:hAnsi="BRH Malayalam Extra" w:cs="BRH Malayalam Extra"/>
+                <w:color w:val="000000"/>
+                <w:sz w:val="40"/>
+                <w:szCs w:val="40"/>
+                <w:lang w:val="it-IT" w:eastAsia="en-IN" w:bidi="ml-IN"/>
+              </w:rPr>
+              <w:t xml:space="preserve"> A</w:t>
             </w:r>
             <w:r>
               <w:rPr>
@@ -1050,7 +1072,45 @@
                 <w:szCs w:val="40"/>
                 <w:lang w:val="it-IT" w:eastAsia="en-IN" w:bidi="ml-IN"/>
               </w:rPr>
-              <w:t>¥sõZõË—sõ - A</w:t>
+              <w:t xml:space="preserve">¥sõZõË—sõ </w:t>
+            </w:r>
+          </w:p>
+          <w:p>
+            <w:pPr>
+              <w:widowControl w:val="0"/>
+              <w:autoSpaceDE w:val="0"/>
+              <w:autoSpaceDN w:val="0"/>
+              <w:adjustRightInd w:val="0"/>
+              <w:spacing w:before="0" w:line="240" w:lineRule="auto"/>
+              <w:rPr>
+                <w:rFonts w:ascii="BRH Malayalam Extra" w:eastAsia="Times New Roman" w:hAnsi="BRH Malayalam Extra" w:cs="BRH Malayalam Extra"/>
+                <w:color w:val="000000"/>
+                <w:sz w:val="40"/>
+                <w:szCs w:val="40"/>
+                <w:lang w:val="it-IT" w:eastAsia="en-IN" w:bidi="ml-IN"/>
+              </w:rPr>
+            </w:pPr>
+            <w:r>
+              <w:rPr>
+                <w:rFonts w:ascii="BRH Malayalam Extra" w:eastAsia="Times New Roman" w:hAnsi="BRH Malayalam Extra" w:cs="BRH Malayalam Extra"/>
+                <w:b/>
+                <w:bCs/>
+                <w:color w:val="000000"/>
+                <w:sz w:val="48"/>
+                <w:szCs w:val="48"/>
+                <w:lang w:val="it-IT" w:eastAsia="en-IN" w:bidi="ml-IN"/>
+              </w:rPr>
+              <w:t>-</w:t>
+            </w:r>
+            <w:r>
+              <w:rPr>
+                <w:rFonts w:ascii="BRH Malayalam Extra" w:eastAsia="Times New Roman" w:hAnsi="BRH Malayalam Extra" w:cs="BRH Malayalam Extra"/>
+                <w:color w:val="000000"/>
+                <w:sz w:val="40"/>
+                <w:szCs w:val="40"/>
+                <w:lang w:val="it-IT" w:eastAsia="en-IN" w:bidi="ml-IN"/>
+              </w:rPr>
+              <w:t xml:space="preserve"> A</w:t>
             </w:r>
             <w:r>
               <w:rPr>
@@ -1452,6 +1512,576 @@
               </w:rPr>
               <w:t>Ãxd˜I |</w:t>
             </w:r>
+          </w:p>
+        </w:tc>
+      </w:tr>
+      <w:tr>
+        <w:trPr>
+          <w:trHeight w:val="1694"/>
+        </w:trPr>
+        <w:tc>
+          <w:tcPr>
+            <w:tcW w:w="4048" w:type="dxa"/>
+          </w:tcPr>
+          <w:p>
+            <w:pPr>
+              <w:widowControl w:val="0"/>
+              <w:tabs>
+                <w:tab w:val="left" w:pos="993"/>
+              </w:tabs>
+              <w:autoSpaceDE w:val="0"/>
+              <w:autoSpaceDN w:val="0"/>
+              <w:adjustRightInd w:val="0"/>
+              <w:spacing w:before="0" w:line="240" w:lineRule="auto"/>
+              <w:ind w:right="297"/>
+              <w:rPr>
+                <w:rFonts w:cs="Arial"/>
+                <w:b/>
+                <w:sz w:val="28"/>
+                <w:szCs w:val="32"/>
+              </w:rPr>
+            </w:pPr>
+            <w:r>
+              <w:rPr>
+                <w:rFonts w:cs="Arial"/>
+                <w:b/>
+                <w:sz w:val="28"/>
+                <w:szCs w:val="32"/>
+              </w:rPr>
+              <w:t>T.S.5.6.</w:t>
+            </w:r>
+            <w:r>
+              <w:rPr>
+                <w:rFonts w:cs="Arial"/>
+                <w:b/>
+                <w:sz w:val="28"/>
+                <w:szCs w:val="32"/>
+              </w:rPr>
+              <w:t>14.1</w:t>
+            </w:r>
+            <w:r>
+              <w:rPr>
+                <w:rFonts w:cs="Arial"/>
+                <w:b/>
+                <w:sz w:val="28"/>
+                <w:szCs w:val="32"/>
+              </w:rPr>
+              <w:t xml:space="preserve"> – Kramam</w:t>
+            </w:r>
+          </w:p>
+          <w:p>
+            <w:pPr>
+              <w:widowControl w:val="0"/>
+              <w:tabs>
+                <w:tab w:val="left" w:pos="993"/>
+              </w:tabs>
+              <w:autoSpaceDE w:val="0"/>
+              <w:autoSpaceDN w:val="0"/>
+              <w:adjustRightInd w:val="0"/>
+              <w:spacing w:before="0" w:line="240" w:lineRule="auto"/>
+              <w:ind w:right="297"/>
+              <w:rPr>
+                <w:rFonts w:cs="Arial"/>
+                <w:b/>
+                <w:sz w:val="28"/>
+                <w:szCs w:val="32"/>
+                <w:lang w:val="en-IN"/>
+              </w:rPr>
+            </w:pPr>
+            <w:r>
+              <w:rPr>
+                <w:rFonts w:cs="Arial"/>
+                <w:b/>
+                <w:sz w:val="28"/>
+                <w:szCs w:val="32"/>
+                <w:lang w:val="en-IN"/>
+              </w:rPr>
+              <w:t>Krama Vaakyam No.– 38</w:t>
+            </w:r>
+          </w:p>
+          <w:p>
+            <w:pPr>
+              <w:widowControl w:val="0"/>
+              <w:tabs>
+                <w:tab w:val="left" w:pos="993"/>
+              </w:tabs>
+              <w:autoSpaceDE w:val="0"/>
+              <w:autoSpaceDN w:val="0"/>
+              <w:adjustRightInd w:val="0"/>
+              <w:spacing w:before="0" w:line="240" w:lineRule="auto"/>
+              <w:ind w:right="297"/>
+              <w:rPr>
+                <w:rFonts w:cs="Arial"/>
+                <w:b/>
+                <w:sz w:val="28"/>
+                <w:szCs w:val="32"/>
+                <w:lang w:val="it-IT"/>
+              </w:rPr>
+            </w:pPr>
+            <w:r>
+              <w:rPr>
+                <w:rFonts w:cs="Arial"/>
+                <w:b/>
+                <w:sz w:val="28"/>
+                <w:szCs w:val="32"/>
+                <w:lang w:val="it-IT"/>
+              </w:rPr>
+              <w:t>Panchaati No</w:t>
+            </w:r>
+            <w:r>
+              <w:rPr>
+                <w:rFonts w:cs="Arial"/>
+                <w:b/>
+                <w:szCs w:val="32"/>
+                <w:lang w:val="it-IT"/>
+              </w:rPr>
+              <w:t>. -</w:t>
+            </w:r>
+            <w:r>
+              <w:rPr>
+                <w:rFonts w:cs="Arial"/>
+                <w:b/>
+                <w:sz w:val="28"/>
+                <w:szCs w:val="28"/>
+                <w:lang w:val="it-IT"/>
+              </w:rPr>
+              <w:t xml:space="preserve"> </w:t>
+            </w:r>
+            <w:r>
+              <w:rPr>
+                <w:rFonts w:cs="Arial"/>
+                <w:b/>
+                <w:sz w:val="28"/>
+                <w:szCs w:val="28"/>
+                <w:lang w:val="it-IT"/>
+              </w:rPr>
+              <w:t>45</w:t>
+            </w:r>
+          </w:p>
+        </w:tc>
+        <w:tc>
+          <w:tcPr>
+            <w:tcW w:w="4819" w:type="dxa"/>
+          </w:tcPr>
+          <w:p>
+            <w:pPr>
+              <w:widowControl w:val="0"/>
+              <w:autoSpaceDE w:val="0"/>
+              <w:autoSpaceDN w:val="0"/>
+              <w:adjustRightInd w:val="0"/>
+              <w:spacing w:before="0" w:line="240" w:lineRule="auto"/>
+              <w:rPr>
+                <w:rFonts w:ascii="BRH Malayalam Extra" w:eastAsia="Times New Roman" w:hAnsi="BRH Malayalam Extra" w:cs="BRH Malayalam Extra"/>
+                <w:color w:val="000000"/>
+                <w:sz w:val="40"/>
+                <w:szCs w:val="40"/>
+                <w:lang w:val="it-IT" w:eastAsia="en-IN" w:bidi="ml-IN"/>
+              </w:rPr>
+            </w:pPr>
+            <w:r>
+              <w:rPr>
+                <w:rFonts w:ascii="BRH Malayalam Extra" w:eastAsia="Times New Roman" w:hAnsi="BRH Malayalam Extra" w:cs="BRH Malayalam Extra"/>
+                <w:color w:val="000000"/>
+                <w:sz w:val="40"/>
+                <w:szCs w:val="40"/>
+                <w:lang w:val="it-IT" w:eastAsia="en-IN" w:bidi="ml-IN"/>
+              </w:rPr>
+              <w:t>¥qõZ—mmxix</w:t>
+            </w:r>
+            <w:r>
+              <w:rPr>
+                <w:rFonts w:ascii="BRH Malayalam Extra" w:eastAsia="Times New Roman" w:hAnsi="BRH Malayalam Extra" w:cs="BRH Malayalam Extra"/>
+                <w:color w:val="000000"/>
+                <w:sz w:val="32"/>
+                <w:szCs w:val="40"/>
+                <w:lang w:val="it-IT" w:eastAsia="en-IN" w:bidi="ml-IN"/>
+              </w:rPr>
+              <w:t>–</w:t>
+            </w:r>
+            <w:r>
+              <w:rPr>
+                <w:rFonts w:ascii="BRH Malayalam Extra" w:eastAsia="Times New Roman" w:hAnsi="BRH Malayalam Extra" w:cs="BRH Malayalam Extra"/>
+                <w:color w:val="000000"/>
+                <w:sz w:val="40"/>
+                <w:szCs w:val="40"/>
+                <w:lang w:val="it-IT" w:eastAsia="en-IN" w:bidi="ml-IN"/>
+              </w:rPr>
+              <w:t xml:space="preserve"> CZy</w:t>
+            </w:r>
+            <w:r>
+              <w:rPr>
+                <w:rFonts w:ascii="BRH Malayalam Extra" w:eastAsia="Times New Roman" w:hAnsi="BRH Malayalam Extra" w:cs="BRH Malayalam Extra"/>
+                <w:color w:val="000000"/>
+                <w:sz w:val="32"/>
+                <w:szCs w:val="40"/>
+                <w:lang w:val="it-IT" w:eastAsia="en-IN" w:bidi="ml-IN"/>
+              </w:rPr>
+              <w:t>–</w:t>
+            </w:r>
+            <w:r>
+              <w:rPr>
+                <w:rFonts w:ascii="BRH Malayalam Extra" w:eastAsia="Times New Roman" w:hAnsi="BRH Malayalam Extra" w:cs="BRH Malayalam Extra"/>
+                <w:color w:val="000000"/>
+                <w:sz w:val="40"/>
+                <w:szCs w:val="40"/>
+                <w:lang w:val="it-IT" w:eastAsia="en-IN" w:bidi="ml-IN"/>
+              </w:rPr>
+              <w:t xml:space="preserve"> </w:t>
+            </w:r>
+          </w:p>
+          <w:p>
+            <w:pPr>
+              <w:widowControl w:val="0"/>
+              <w:autoSpaceDE w:val="0"/>
+              <w:autoSpaceDN w:val="0"/>
+              <w:adjustRightInd w:val="0"/>
+              <w:spacing w:before="0" w:line="240" w:lineRule="auto"/>
+              <w:rPr>
+                <w:rFonts w:ascii="BRH Devanagari Extra" w:hAnsi="BRH Devanagari Extra" w:cs="BRH Devanagari Extra"/>
+                <w:color w:val="000000"/>
+                <w:sz w:val="40"/>
+                <w:szCs w:val="40"/>
+                <w:highlight w:val="yellow"/>
+                <w:lang w:val="it-IT" w:bidi="ml-IN"/>
+              </w:rPr>
+            </w:pPr>
+            <w:r>
+              <w:rPr>
+                <w:rFonts w:ascii="BRH Malayalam Extra" w:eastAsia="Times New Roman" w:hAnsi="BRH Malayalam Extra" w:cs="BRH Malayalam Extra"/>
+                <w:color w:val="000000"/>
+                <w:sz w:val="40"/>
+                <w:szCs w:val="40"/>
+                <w:highlight w:val="yellow"/>
+                <w:lang w:val="it-IT" w:eastAsia="en-IN" w:bidi="ml-IN"/>
+              </w:rPr>
+              <w:t>¥q</w:t>
+            </w:r>
+            <w:r>
+              <w:rPr>
+                <w:rFonts w:ascii="BRH Malayalam Extra" w:eastAsia="Times New Roman" w:hAnsi="BRH Malayalam Extra" w:cs="BRH Malayalam Extra"/>
+                <w:color w:val="000000"/>
+                <w:sz w:val="40"/>
+                <w:szCs w:val="40"/>
+                <w:lang w:val="it-IT" w:eastAsia="en-IN" w:bidi="ml-IN"/>
+              </w:rPr>
+              <w:t>Z— - m</w:t>
+            </w:r>
+            <w:r>
+              <w:rPr>
+                <w:rFonts w:ascii="BRH Malayalam Extra" w:eastAsia="Times New Roman" w:hAnsi="BRH Malayalam Extra" w:cs="BRH Malayalam Extra"/>
+                <w:color w:val="000000"/>
+                <w:sz w:val="32"/>
+                <w:szCs w:val="40"/>
+                <w:lang w:val="it-IT" w:eastAsia="en-IN" w:bidi="ml-IN"/>
+              </w:rPr>
+              <w:t>–</w:t>
+            </w:r>
+            <w:r>
+              <w:rPr>
+                <w:rFonts w:ascii="BRH Malayalam Extra" w:eastAsia="Times New Roman" w:hAnsi="BRH Malayalam Extra" w:cs="BRH Malayalam Extra"/>
+                <w:color w:val="000000"/>
+                <w:sz w:val="40"/>
+                <w:szCs w:val="40"/>
+                <w:lang w:val="it-IT" w:eastAsia="en-IN" w:bidi="ml-IN"/>
+              </w:rPr>
+              <w:t>mx</w:t>
+            </w:r>
+            <w:r>
+              <w:rPr>
+                <w:rFonts w:ascii="BRH Malayalam Extra" w:eastAsia="Times New Roman" w:hAnsi="BRH Malayalam Extra" w:cs="BRH Malayalam Extra"/>
+                <w:color w:val="000000"/>
+                <w:sz w:val="32"/>
+                <w:szCs w:val="40"/>
+                <w:lang w:val="it-IT" w:eastAsia="en-IN" w:bidi="ml-IN"/>
+              </w:rPr>
+              <w:t>–</w:t>
+            </w:r>
+            <w:r>
+              <w:rPr>
+                <w:rFonts w:ascii="BRH Malayalam Extra" w:eastAsia="Times New Roman" w:hAnsi="BRH Malayalam Extra" w:cs="BRH Malayalam Extra"/>
+                <w:color w:val="000000"/>
+                <w:sz w:val="40"/>
+                <w:szCs w:val="40"/>
+                <w:lang w:val="it-IT" w:eastAsia="en-IN" w:bidi="ml-IN"/>
+              </w:rPr>
+              <w:t>ix</w:t>
+            </w:r>
+            <w:r>
+              <w:rPr>
+                <w:rFonts w:ascii="BRH Malayalam Extra" w:eastAsia="Times New Roman" w:hAnsi="BRH Malayalam Extra" w:cs="BRH Malayalam Extra"/>
+                <w:color w:val="000000"/>
+                <w:sz w:val="32"/>
+                <w:szCs w:val="40"/>
+                <w:lang w:val="it-IT" w:eastAsia="en-IN" w:bidi="ml-IN"/>
+              </w:rPr>
+              <w:t>–</w:t>
+            </w:r>
+            <w:r>
+              <w:rPr>
+                <w:rFonts w:ascii="BRH Malayalam Extra" w:eastAsia="Times New Roman" w:hAnsi="BRH Malayalam Extra" w:cs="BRH Malayalam Extra"/>
+                <w:color w:val="000000"/>
+                <w:sz w:val="40"/>
+                <w:szCs w:val="40"/>
+                <w:lang w:val="it-IT" w:eastAsia="en-IN" w:bidi="ml-IN"/>
+              </w:rPr>
+              <w:t>J |</w:t>
+            </w:r>
+          </w:p>
+        </w:tc>
+        <w:tc>
+          <w:tcPr>
+            <w:tcW w:w="5103" w:type="dxa"/>
+          </w:tcPr>
+          <w:p>
+            <w:pPr>
+              <w:widowControl w:val="0"/>
+              <w:tabs>
+                <w:tab w:val="left" w:pos="2552"/>
+              </w:tabs>
+              <w:autoSpaceDE w:val="0"/>
+              <w:autoSpaceDN w:val="0"/>
+              <w:adjustRightInd w:val="0"/>
+              <w:spacing w:before="0" w:line="240" w:lineRule="auto"/>
+              <w:rPr>
+                <w:rFonts w:ascii="BRH Malayalam Extra" w:eastAsia="Times New Roman" w:hAnsi="BRH Malayalam Extra" w:cs="BRH Malayalam Extra"/>
+                <w:color w:val="000000"/>
+                <w:sz w:val="40"/>
+                <w:szCs w:val="40"/>
+                <w:lang w:val="it-IT" w:eastAsia="en-IN" w:bidi="ml-IN"/>
+              </w:rPr>
+            </w:pPr>
+            <w:r>
+              <w:rPr>
+                <w:rFonts w:ascii="BRH Malayalam Extra" w:eastAsia="Times New Roman" w:hAnsi="BRH Malayalam Extra" w:cs="BRH Malayalam Extra"/>
+                <w:color w:val="000000"/>
+                <w:sz w:val="40"/>
+                <w:szCs w:val="40"/>
+                <w:lang w:val="it-IT" w:eastAsia="en-IN" w:bidi="ml-IN"/>
+              </w:rPr>
+              <w:t>¥qõZ—mmxix</w:t>
+            </w:r>
+            <w:r>
+              <w:rPr>
+                <w:rFonts w:ascii="BRH Malayalam Extra" w:eastAsia="Times New Roman" w:hAnsi="BRH Malayalam Extra" w:cs="BRH Malayalam Extra"/>
+                <w:color w:val="000000"/>
+                <w:sz w:val="32"/>
+                <w:szCs w:val="40"/>
+                <w:lang w:val="it-IT" w:eastAsia="en-IN" w:bidi="ml-IN"/>
+              </w:rPr>
+              <w:t>–</w:t>
+            </w:r>
+            <w:r>
+              <w:rPr>
+                <w:rFonts w:ascii="BRH Malayalam Extra" w:eastAsia="Times New Roman" w:hAnsi="BRH Malayalam Extra" w:cs="BRH Malayalam Extra"/>
+                <w:color w:val="000000"/>
+                <w:sz w:val="40"/>
+                <w:szCs w:val="40"/>
+                <w:lang w:val="it-IT" w:eastAsia="en-IN" w:bidi="ml-IN"/>
+              </w:rPr>
+              <w:t xml:space="preserve"> CZy</w:t>
+            </w:r>
+            <w:r>
+              <w:rPr>
+                <w:rFonts w:ascii="BRH Malayalam Extra" w:eastAsia="Times New Roman" w:hAnsi="BRH Malayalam Extra" w:cs="BRH Malayalam Extra"/>
+                <w:color w:val="000000"/>
+                <w:sz w:val="32"/>
+                <w:szCs w:val="40"/>
+                <w:lang w:val="it-IT" w:eastAsia="en-IN" w:bidi="ml-IN"/>
+              </w:rPr>
+              <w:t>–</w:t>
+            </w:r>
+            <w:r>
+              <w:rPr>
+                <w:rFonts w:ascii="BRH Malayalam Extra" w:eastAsia="Times New Roman" w:hAnsi="BRH Malayalam Extra" w:cs="BRH Malayalam Extra"/>
+                <w:color w:val="000000"/>
+                <w:sz w:val="40"/>
+                <w:szCs w:val="40"/>
+                <w:lang w:val="it-IT" w:eastAsia="en-IN" w:bidi="ml-IN"/>
+              </w:rPr>
+              <w:t xml:space="preserve"> ¥</w:t>
+            </w:r>
+          </w:p>
+          <w:p>
+            <w:pPr>
+              <w:widowControl w:val="0"/>
+              <w:tabs>
+                <w:tab w:val="left" w:pos="2552"/>
+              </w:tabs>
+              <w:autoSpaceDE w:val="0"/>
+              <w:autoSpaceDN w:val="0"/>
+              <w:adjustRightInd w:val="0"/>
+              <w:spacing w:before="0" w:line="240" w:lineRule="auto"/>
+              <w:rPr>
+                <w:rFonts w:ascii="BRH Devanagari Extra" w:hAnsi="BRH Devanagari Extra" w:cs="BRH Devanagari Extra"/>
+                <w:color w:val="000000"/>
+                <w:sz w:val="40"/>
+                <w:szCs w:val="40"/>
+                <w:lang w:val="it-IT" w:bidi="ml-IN"/>
+              </w:rPr>
+            </w:pPr>
+            <w:r>
+              <w:rPr>
+                <w:rFonts w:ascii="BRH Malayalam Extra" w:eastAsia="Times New Roman" w:hAnsi="BRH Malayalam Extra" w:cs="BRH Malayalam Extra"/>
+                <w:color w:val="000000"/>
+                <w:sz w:val="40"/>
+                <w:szCs w:val="40"/>
+                <w:lang w:val="it-IT" w:eastAsia="en-IN" w:bidi="ml-IN"/>
+              </w:rPr>
+              <w:t>q</w:t>
+            </w:r>
+            <w:r>
+              <w:rPr>
+                <w:rFonts w:ascii="BRH Malayalam Extra" w:eastAsia="Times New Roman" w:hAnsi="BRH Malayalam Extra" w:cs="BRH Malayalam Extra"/>
+                <w:color w:val="000000"/>
+                <w:sz w:val="40"/>
+                <w:szCs w:val="40"/>
+                <w:highlight w:val="green"/>
+                <w:lang w:val="it-IT" w:eastAsia="en-IN" w:bidi="ml-IN"/>
+              </w:rPr>
+              <w:t>õ</w:t>
+            </w:r>
+            <w:r>
+              <w:rPr>
+                <w:rFonts w:ascii="BRH Malayalam Extra" w:eastAsia="Times New Roman" w:hAnsi="BRH Malayalam Extra" w:cs="BRH Malayalam Extra"/>
+                <w:color w:val="000000"/>
+                <w:sz w:val="40"/>
+                <w:szCs w:val="40"/>
+                <w:lang w:val="it-IT" w:eastAsia="en-IN" w:bidi="ml-IN"/>
+              </w:rPr>
+              <w:t>Z— - m</w:t>
+            </w:r>
+            <w:r>
+              <w:rPr>
+                <w:rFonts w:ascii="BRH Malayalam Extra" w:eastAsia="Times New Roman" w:hAnsi="BRH Malayalam Extra" w:cs="BRH Malayalam Extra"/>
+                <w:color w:val="000000"/>
+                <w:sz w:val="32"/>
+                <w:szCs w:val="40"/>
+                <w:lang w:val="it-IT" w:eastAsia="en-IN" w:bidi="ml-IN"/>
+              </w:rPr>
+              <w:t>–</w:t>
+            </w:r>
+            <w:r>
+              <w:rPr>
+                <w:rFonts w:ascii="BRH Malayalam Extra" w:eastAsia="Times New Roman" w:hAnsi="BRH Malayalam Extra" w:cs="BRH Malayalam Extra"/>
+                <w:color w:val="000000"/>
+                <w:sz w:val="40"/>
+                <w:szCs w:val="40"/>
+                <w:lang w:val="it-IT" w:eastAsia="en-IN" w:bidi="ml-IN"/>
+              </w:rPr>
+              <w:t>mx</w:t>
+            </w:r>
+            <w:r>
+              <w:rPr>
+                <w:rFonts w:ascii="BRH Malayalam Extra" w:eastAsia="Times New Roman" w:hAnsi="BRH Malayalam Extra" w:cs="BRH Malayalam Extra"/>
+                <w:color w:val="000000"/>
+                <w:sz w:val="32"/>
+                <w:szCs w:val="40"/>
+                <w:lang w:val="it-IT" w:eastAsia="en-IN" w:bidi="ml-IN"/>
+              </w:rPr>
+              <w:t>–</w:t>
+            </w:r>
+            <w:r>
+              <w:rPr>
+                <w:rFonts w:ascii="BRH Malayalam Extra" w:eastAsia="Times New Roman" w:hAnsi="BRH Malayalam Extra" w:cs="BRH Malayalam Extra"/>
+                <w:color w:val="000000"/>
+                <w:sz w:val="40"/>
+                <w:szCs w:val="40"/>
+                <w:lang w:val="it-IT" w:eastAsia="en-IN" w:bidi="ml-IN"/>
+              </w:rPr>
+              <w:t>ix</w:t>
+            </w:r>
+            <w:r>
+              <w:rPr>
+                <w:rFonts w:ascii="BRH Malayalam Extra" w:eastAsia="Times New Roman" w:hAnsi="BRH Malayalam Extra" w:cs="BRH Malayalam Extra"/>
+                <w:color w:val="000000"/>
+                <w:sz w:val="32"/>
+                <w:szCs w:val="40"/>
+                <w:lang w:val="it-IT" w:eastAsia="en-IN" w:bidi="ml-IN"/>
+              </w:rPr>
+              <w:t>–</w:t>
+            </w:r>
+            <w:r>
+              <w:rPr>
+                <w:rFonts w:ascii="BRH Malayalam Extra" w:eastAsia="Times New Roman" w:hAnsi="BRH Malayalam Extra" w:cs="BRH Malayalam Extra"/>
+                <w:color w:val="000000"/>
+                <w:sz w:val="40"/>
+                <w:szCs w:val="40"/>
+                <w:lang w:val="it-IT" w:eastAsia="en-IN" w:bidi="ml-IN"/>
+              </w:rPr>
+              <w:t>J |</w:t>
+            </w:r>
+          </w:p>
+        </w:tc>
+      </w:tr>
+      <w:tr>
+        <w:trPr>
+          <w:trHeight w:val="1419"/>
+        </w:trPr>
+        <w:tc>
+          <w:tcPr>
+            <w:tcW w:w="4048" w:type="dxa"/>
+          </w:tcPr>
+          <w:p>
+            <w:pPr>
+              <w:widowControl w:val="0"/>
+              <w:tabs>
+                <w:tab w:val="left" w:pos="993"/>
+              </w:tabs>
+              <w:autoSpaceDE w:val="0"/>
+              <w:autoSpaceDN w:val="0"/>
+              <w:adjustRightInd w:val="0"/>
+              <w:spacing w:before="0" w:line="252" w:lineRule="auto"/>
+              <w:ind w:right="297"/>
+              <w:rPr>
+                <w:rFonts w:cs="Arial"/>
+                <w:b/>
+                <w:sz w:val="28"/>
+                <w:szCs w:val="32"/>
+                <w:lang w:val="it-IT"/>
+              </w:rPr>
+            </w:pPr>
+          </w:p>
+        </w:tc>
+        <w:tc>
+          <w:tcPr>
+            <w:tcW w:w="4819" w:type="dxa"/>
+          </w:tcPr>
+          <w:p>
+            <w:pPr>
+              <w:widowControl w:val="0"/>
+              <w:autoSpaceDE w:val="0"/>
+              <w:autoSpaceDN w:val="0"/>
+              <w:adjustRightInd w:val="0"/>
+              <w:spacing w:before="0" w:line="240" w:lineRule="auto"/>
+              <w:rPr>
+                <w:rFonts w:ascii="BRH Malayalam Extra" w:eastAsia="Times New Roman" w:hAnsi="BRH Malayalam Extra" w:cs="BRH Malayalam Extra"/>
+                <w:color w:val="000000"/>
+                <w:sz w:val="40"/>
+                <w:szCs w:val="40"/>
+                <w:lang w:val="it-IT" w:eastAsia="en-IN" w:bidi="ml-IN"/>
+              </w:rPr>
+            </w:pPr>
+          </w:p>
+        </w:tc>
+        <w:tc>
+          <w:tcPr>
+            <w:tcW w:w="5103" w:type="dxa"/>
+          </w:tcPr>
+          <w:p>
+            <w:pPr>
+              <w:widowControl w:val="0"/>
+              <w:autoSpaceDE w:val="0"/>
+              <w:autoSpaceDN w:val="0"/>
+              <w:adjustRightInd w:val="0"/>
+              <w:spacing w:before="0" w:line="240" w:lineRule="auto"/>
+              <w:rPr>
+                <w:rFonts w:ascii="BRH Malayalam Extra" w:eastAsia="Times New Roman" w:hAnsi="BRH Malayalam Extra" w:cs="BRH Malayalam Extra"/>
+                <w:color w:val="000000"/>
+                <w:sz w:val="40"/>
+                <w:szCs w:val="40"/>
+                <w:lang w:val="it-IT" w:eastAsia="en-IN" w:bidi="ml-IN"/>
+              </w:rPr>
+            </w:pPr>
           </w:p>
         </w:tc>
       </w:tr>
@@ -1707,7 +2337,6 @@
                 <w:sz w:val="32"/>
                 <w:szCs w:val="32"/>
               </w:rPr>
-              <w:lastRenderedPageBreak/>
               <w:t>Reference</w:t>
             </w:r>
           </w:p>
@@ -1730,7 +2359,6 @@
                 <w:sz w:val="32"/>
                 <w:szCs w:val="32"/>
               </w:rPr>
-              <w:lastRenderedPageBreak/>
               <w:t>As Printed</w:t>
             </w:r>
           </w:p>
@@ -2455,6 +3083,7 @@
                 <w:sz w:val="28"/>
                 <w:szCs w:val="32"/>
               </w:rPr>
+              <w:lastRenderedPageBreak/>
               <w:t>T.S.5.6.1.3 – Kramam</w:t>
             </w:r>
           </w:p>
@@ -3480,7 +4109,6 @@
                 <w:sz w:val="28"/>
                 <w:szCs w:val="32"/>
               </w:rPr>
-              <w:lastRenderedPageBreak/>
               <w:t>T.S.5.6.3.1 – Kramam</w:t>
             </w:r>
           </w:p>
@@ -4889,6 +5517,7 @@
                 <w:sz w:val="28"/>
                 <w:szCs w:val="32"/>
               </w:rPr>
+              <w:lastRenderedPageBreak/>
               <w:t>T.S.5.6.6.4 – Kramam</w:t>
             </w:r>
           </w:p>
@@ -5908,7 +6537,6 @@
                 <w:sz w:val="28"/>
                 <w:szCs w:val="32"/>
               </w:rPr>
-              <w:lastRenderedPageBreak/>
               <w:t>T.S.5.6.10.2 – Kramam</w:t>
             </w:r>
           </w:p>
@@ -7173,6 +7801,7 @@
                 <w:szCs w:val="40"/>
                 <w:lang w:val="en-IN" w:eastAsia="en-IN" w:bidi="ml-IN"/>
               </w:rPr>
+              <w:lastRenderedPageBreak/>
               <w:t>öZy - Apõ—J |</w:t>
             </w:r>
           </w:p>
@@ -7204,6 +7833,7 @@
                 <w:szCs w:val="40"/>
                 <w:lang w:val="en-IN" w:eastAsia="en-IN" w:bidi="ml-IN"/>
               </w:rPr>
+              <w:lastRenderedPageBreak/>
               <w:t>¥kxty—Yz</w:t>
             </w:r>
             <w:r>
@@ -7348,6 +7978,7 @@
                 <w:szCs w:val="40"/>
                 <w:lang w:val="en-IN" w:eastAsia="en-IN" w:bidi="ml-IN"/>
               </w:rPr>
+              <w:lastRenderedPageBreak/>
               <w:t>öZy - Apõ—J |</w:t>
             </w:r>
             <w:r>
@@ -7441,6 +8072,7 @@
                 <w:sz w:val="28"/>
                 <w:szCs w:val="32"/>
               </w:rPr>
+              <w:lastRenderedPageBreak/>
               <w:t>T.S.5.6.22.1 – Kramam</w:t>
             </w:r>
           </w:p>
@@ -8283,7 +8915,6 @@
                 <w:sz w:val="28"/>
                 <w:szCs w:val="32"/>
               </w:rPr>
-              <w:lastRenderedPageBreak/>
               <w:t>T.S.5.6.16.1 – Kramam</w:t>
             </w:r>
           </w:p>

</xml_diff>

<commit_message>
nmv 16 06 2026
</commit_message>
<xml_diff>
--- a/TS-Kramam/TS-5.6/TS 5.6 Malayalam Krama Paatam Corrections.docx
+++ b/TS-Kramam/TS-5.6/TS 5.6 Malayalam Krama Paatam Corrections.docx
@@ -44,7 +44,6 @@
         </w:rPr>
         <w:t xml:space="preserve"> Paatam – TS </w:t>
       </w:r>
-      <w:proofErr w:type="gramStart"/>
       <w:r>
         <w:rPr>
           <w:b/>
@@ -95,7 +94,6 @@
         </w:rPr>
         <w:t>am</w:t>
       </w:r>
-      <w:proofErr w:type="gramEnd"/>
       <w:r>
         <w:rPr>
           <w:b/>
@@ -124,18 +122,7 @@
           <w:szCs w:val="32"/>
           <w:u w:val="single"/>
         </w:rPr>
-        <w:t xml:space="preserve">Observed </w:t>
-      </w:r>
-      <w:proofErr w:type="gramStart"/>
-      <w:r>
-        <w:rPr>
-          <w:b/>
-          <w:bCs/>
-          <w:sz w:val="32"/>
-          <w:szCs w:val="32"/>
-          <w:u w:val="single"/>
-        </w:rPr>
-        <w:t xml:space="preserve">till </w:t>
+        <w:t xml:space="preserve">Observed till </w:t>
       </w:r>
       <w:r>
         <w:rPr>
@@ -148,7 +135,6 @@
         </w:rPr>
         <w:t>????</w:t>
       </w:r>
-      <w:proofErr w:type="gramEnd"/>
     </w:p>
     <w:p>
       <w:pPr>
@@ -2030,6 +2016,102 @@
               <w:autoSpaceDE w:val="0"/>
               <w:autoSpaceDN w:val="0"/>
               <w:adjustRightInd w:val="0"/>
+              <w:spacing w:before="0" w:line="240" w:lineRule="auto"/>
+              <w:ind w:right="297"/>
+              <w:rPr>
+                <w:rFonts w:cs="Arial"/>
+                <w:b/>
+                <w:sz w:val="28"/>
+                <w:szCs w:val="32"/>
+              </w:rPr>
+            </w:pPr>
+            <w:r>
+              <w:rPr>
+                <w:rFonts w:cs="Arial"/>
+                <w:b/>
+                <w:sz w:val="28"/>
+                <w:szCs w:val="32"/>
+              </w:rPr>
+              <w:lastRenderedPageBreak/>
+              <w:t>T.S.5.6.</w:t>
+            </w:r>
+            <w:r>
+              <w:rPr>
+                <w:rFonts w:cs="Arial"/>
+                <w:b/>
+                <w:sz w:val="28"/>
+                <w:szCs w:val="32"/>
+              </w:rPr>
+              <w:t>21</w:t>
+            </w:r>
+            <w:r>
+              <w:rPr>
+                <w:rFonts w:cs="Arial"/>
+                <w:b/>
+                <w:sz w:val="28"/>
+                <w:szCs w:val="32"/>
+              </w:rPr>
+              <w:t>.1</w:t>
+            </w:r>
+            <w:r>
+              <w:rPr>
+                <w:rFonts w:cs="Arial"/>
+                <w:b/>
+                <w:sz w:val="28"/>
+                <w:szCs w:val="32"/>
+              </w:rPr>
+              <w:t xml:space="preserve"> – Kramam</w:t>
+            </w:r>
+          </w:p>
+          <w:p>
+            <w:pPr>
+              <w:widowControl w:val="0"/>
+              <w:tabs>
+                <w:tab w:val="left" w:pos="993"/>
+              </w:tabs>
+              <w:autoSpaceDE w:val="0"/>
+              <w:autoSpaceDN w:val="0"/>
+              <w:adjustRightInd w:val="0"/>
+              <w:spacing w:before="0" w:line="240" w:lineRule="auto"/>
+              <w:ind w:right="297"/>
+              <w:rPr>
+                <w:rFonts w:cs="Arial"/>
+                <w:b/>
+                <w:sz w:val="28"/>
+                <w:szCs w:val="32"/>
+                <w:lang w:val="it-IT"/>
+              </w:rPr>
+            </w:pPr>
+            <w:r>
+              <w:rPr>
+                <w:rFonts w:cs="Arial"/>
+                <w:b/>
+                <w:sz w:val="28"/>
+                <w:szCs w:val="32"/>
+                <w:lang w:val="it-IT"/>
+              </w:rPr>
+              <w:t xml:space="preserve">Krama Vaakyam No.– </w:t>
+            </w:r>
+            <w:r>
+              <w:rPr>
+                <w:rFonts w:cs="Arial"/>
+                <w:b/>
+                <w:sz w:val="28"/>
+                <w:szCs w:val="32"/>
+                <w:lang w:val="it-IT"/>
+              </w:rPr>
+              <w:t>10</w:t>
+            </w:r>
+          </w:p>
+          <w:p>
+            <w:pPr>
+              <w:widowControl w:val="0"/>
+              <w:tabs>
+                <w:tab w:val="left" w:pos="993"/>
+              </w:tabs>
+              <w:autoSpaceDE w:val="0"/>
+              <w:autoSpaceDN w:val="0"/>
+              <w:adjustRightInd w:val="0"/>
               <w:spacing w:before="0" w:line="252" w:lineRule="auto"/>
               <w:ind w:right="297"/>
               <w:rPr>
@@ -2040,6 +2122,45 @@
                 <w:lang w:val="it-IT"/>
               </w:rPr>
             </w:pPr>
+            <w:r>
+              <w:rPr>
+                <w:rFonts w:cs="Arial"/>
+                <w:b/>
+                <w:sz w:val="28"/>
+                <w:szCs w:val="32"/>
+                <w:lang w:val="it-IT"/>
+              </w:rPr>
+              <w:t>Panchaati No</w:t>
+            </w:r>
+            <w:r>
+              <w:rPr>
+                <w:rFonts w:cs="Arial"/>
+                <w:b/>
+                <w:szCs w:val="32"/>
+                <w:lang w:val="it-IT"/>
+              </w:rPr>
+              <w:t>. -</w:t>
+            </w:r>
+            <w:r>
+              <w:rPr>
+                <w:rFonts w:cs="Arial"/>
+                <w:b/>
+                <w:sz w:val="28"/>
+                <w:szCs w:val="28"/>
+                <w:lang w:val="it-IT"/>
+              </w:rPr>
+              <w:t xml:space="preserve"> </w:t>
+            </w:r>
+            <w:r>
+              <w:rPr>
+                <w:rFonts w:cs="Arial"/>
+                <w:b/>
+                <w:sz w:val="28"/>
+                <w:szCs w:val="28"/>
+                <w:lang w:val="it-IT"/>
+              </w:rPr>
+              <w:t>32</w:t>
+            </w:r>
           </w:p>
         </w:tc>
         <w:tc>
@@ -2061,6 +2182,183 @@
                 <w:lang w:val="it-IT" w:eastAsia="en-IN" w:bidi="ml-IN"/>
               </w:rPr>
             </w:pPr>
+            <w:r>
+              <w:rPr>
+                <w:rFonts w:ascii="BRH Malayalam Extra" w:eastAsia="Times New Roman" w:hAnsi="BRH Malayalam Extra" w:cs="BRH Malayalam Extra"/>
+                <w:color w:val="000000"/>
+                <w:sz w:val="40"/>
+                <w:szCs w:val="40"/>
+                <w:lang w:val="it-IT" w:eastAsia="en-IN" w:bidi="ml-IN"/>
+              </w:rPr>
+              <w:t>Hx</w:t>
+            </w:r>
+            <w:r>
+              <w:rPr>
+                <w:rFonts w:ascii="BRH Malayalam Extra" w:eastAsia="Times New Roman" w:hAnsi="BRH Malayalam Extra" w:cs="BRH Malayalam Extra"/>
+                <w:color w:val="000000"/>
+                <w:sz w:val="32"/>
+                <w:szCs w:val="40"/>
+                <w:lang w:val="it-IT" w:eastAsia="en-IN" w:bidi="ml-IN"/>
+              </w:rPr>
+              <w:t>–</w:t>
+            </w:r>
+            <w:r>
+              <w:rPr>
+                <w:rFonts w:ascii="BRH Malayalam Extra" w:eastAsia="Times New Roman" w:hAnsi="BRH Malayalam Extra" w:cs="BRH Malayalam Extra"/>
+                <w:color w:val="000000"/>
+                <w:sz w:val="40"/>
+                <w:szCs w:val="40"/>
+                <w:lang w:val="it-IT" w:eastAsia="en-IN" w:bidi="ml-IN"/>
+              </w:rPr>
+              <w:t>¥Rx</w:t>
+            </w:r>
+            <w:r>
+              <w:rPr>
+                <w:rFonts w:ascii="BRH Malayalam Extra" w:eastAsia="Times New Roman" w:hAnsi="BRH Malayalam Extra" w:cs="BRH Malayalam Extra"/>
+                <w:color w:val="000000"/>
+                <w:sz w:val="32"/>
+                <w:szCs w:val="40"/>
+                <w:lang w:val="it-IT" w:eastAsia="en-IN" w:bidi="ml-IN"/>
+              </w:rPr>
+              <w:t>–</w:t>
+            </w:r>
+            <w:r>
+              <w:rPr>
+                <w:rFonts w:ascii="BRH Malayalam Extra" w:eastAsia="Times New Roman" w:hAnsi="BRH Malayalam Extra" w:cs="BRH Malayalam Extra"/>
+                <w:color w:val="000000"/>
+                <w:sz w:val="40"/>
+                <w:szCs w:val="40"/>
+                <w:lang w:val="it-IT" w:eastAsia="en-IN" w:bidi="ml-IN"/>
+              </w:rPr>
+              <w:t>bxhõx</w:t>
+            </w:r>
+            <w:r>
+              <w:rPr>
+                <w:rFonts w:ascii="BRH Malayalam Extra" w:eastAsia="Times New Roman" w:hAnsi="BRH Malayalam Extra" w:cs="BRH Malayalam Extra"/>
+                <w:color w:val="000000"/>
+                <w:sz w:val="32"/>
+                <w:szCs w:val="40"/>
+                <w:lang w:val="it-IT" w:eastAsia="en-IN" w:bidi="ml-IN"/>
+              </w:rPr>
+              <w:t>–</w:t>
+            </w:r>
+            <w:r>
+              <w:rPr>
+                <w:rFonts w:ascii="BRH Malayalam Extra" w:eastAsia="Times New Roman" w:hAnsi="BRH Malayalam Extra" w:cs="BRH Malayalam Extra"/>
+                <w:color w:val="000000"/>
+                <w:sz w:val="40"/>
+                <w:szCs w:val="40"/>
+                <w:lang w:val="it-IT" w:eastAsia="en-IN" w:bidi="ml-IN"/>
+              </w:rPr>
+              <w:t xml:space="preserve">i¡ræx—k¦ | </w:t>
+            </w:r>
+          </w:p>
+          <w:p>
+            <w:pPr>
+              <w:widowControl w:val="0"/>
+              <w:autoSpaceDE w:val="0"/>
+              <w:autoSpaceDN w:val="0"/>
+              <w:adjustRightInd w:val="0"/>
+              <w:spacing w:before="0" w:line="240" w:lineRule="auto"/>
+              <w:rPr>
+                <w:rFonts w:ascii="BRH Malayalam Extra" w:eastAsia="Times New Roman" w:hAnsi="BRH Malayalam Extra" w:cs="BRH Malayalam Extra"/>
+                <w:color w:val="000000"/>
+                <w:sz w:val="40"/>
+                <w:szCs w:val="40"/>
+                <w:lang w:val="it-IT" w:eastAsia="en-IN" w:bidi="ml-IN"/>
+              </w:rPr>
+            </w:pPr>
+            <w:r>
+              <w:rPr>
+                <w:rFonts w:ascii="BRH Malayalam Extra" w:eastAsia="Times New Roman" w:hAnsi="BRH Malayalam Extra" w:cs="BRH Malayalam Extra"/>
+                <w:color w:val="000000"/>
+                <w:sz w:val="40"/>
+                <w:szCs w:val="40"/>
+                <w:lang w:val="it-IT" w:eastAsia="en-IN" w:bidi="ml-IN"/>
+              </w:rPr>
+              <w:t>Hx</w:t>
+            </w:r>
+            <w:r>
+              <w:rPr>
+                <w:rFonts w:ascii="BRH Malayalam Extra" w:eastAsia="Times New Roman" w:hAnsi="BRH Malayalam Extra" w:cs="BRH Malayalam Extra"/>
+                <w:color w:val="000000"/>
+                <w:sz w:val="32"/>
+                <w:szCs w:val="40"/>
+                <w:lang w:val="it-IT" w:eastAsia="en-IN" w:bidi="ml-IN"/>
+              </w:rPr>
+              <w:t>–</w:t>
+            </w:r>
+            <w:r>
+              <w:rPr>
+                <w:rFonts w:ascii="BRH Malayalam Extra" w:eastAsia="Times New Roman" w:hAnsi="BRH Malayalam Extra" w:cs="BRH Malayalam Extra"/>
+                <w:color w:val="000000"/>
+                <w:sz w:val="40"/>
+                <w:szCs w:val="40"/>
+                <w:lang w:val="it-IT" w:eastAsia="en-IN" w:bidi="ml-IN"/>
+              </w:rPr>
+              <w:t>¥Rx</w:t>
+            </w:r>
+            <w:r>
+              <w:rPr>
+                <w:rFonts w:ascii="BRH Malayalam Extra" w:eastAsia="Times New Roman" w:hAnsi="BRH Malayalam Extra" w:cs="BRH Malayalam Extra"/>
+                <w:color w:val="000000"/>
+                <w:sz w:val="32"/>
+                <w:szCs w:val="40"/>
+                <w:lang w:val="it-IT" w:eastAsia="en-IN" w:bidi="ml-IN"/>
+              </w:rPr>
+              <w:t>–</w:t>
+            </w:r>
+            <w:r>
+              <w:rPr>
+                <w:rFonts w:ascii="BRH Malayalam Extra" w:eastAsia="Times New Roman" w:hAnsi="BRH Malayalam Extra" w:cs="BRH Malayalam Extra"/>
+                <w:color w:val="000000"/>
+                <w:sz w:val="40"/>
+                <w:szCs w:val="40"/>
+                <w:lang w:val="it-IT" w:eastAsia="en-IN" w:bidi="ml-IN"/>
+              </w:rPr>
+              <w:t>bxhõx</w:t>
+            </w:r>
+            <w:r>
+              <w:rPr>
+                <w:rFonts w:ascii="BRH Malayalam Extra" w:eastAsia="Times New Roman" w:hAnsi="BRH Malayalam Extra" w:cs="BRH Malayalam Extra"/>
+                <w:color w:val="000000"/>
+                <w:sz w:val="32"/>
+                <w:szCs w:val="40"/>
+                <w:lang w:val="it-IT" w:eastAsia="en-IN" w:bidi="ml-IN"/>
+              </w:rPr>
+              <w:t>–</w:t>
+            </w:r>
+            <w:r>
+              <w:rPr>
+                <w:rFonts w:ascii="BRH Malayalam Extra" w:eastAsia="Times New Roman" w:hAnsi="BRH Malayalam Extra" w:cs="BRH Malayalam Extra"/>
+                <w:color w:val="000000"/>
+                <w:sz w:val="40"/>
+                <w:szCs w:val="40"/>
+                <w:lang w:val="it-IT" w:eastAsia="en-IN" w:bidi="ml-IN"/>
+              </w:rPr>
+              <w:t>iy¥Zõx—RJ - bx</w:t>
+            </w:r>
+            <w:r>
+              <w:rPr>
+                <w:rFonts w:ascii="BRH Malayalam Extra" w:eastAsia="Times New Roman" w:hAnsi="BRH Malayalam Extra" w:cs="BRH Malayalam Extra"/>
+                <w:color w:val="000000"/>
+                <w:sz w:val="40"/>
+                <w:szCs w:val="40"/>
+                <w:highlight w:val="yellow"/>
+                <w:lang w:val="it-IT" w:eastAsia="en-IN" w:bidi="ml-IN"/>
+              </w:rPr>
+              <w:t>hõ˜</w:t>
+            </w:r>
+            <w:r>
+              <w:rPr>
+                <w:rFonts w:ascii="BRH Malayalam Extra" w:eastAsia="Times New Roman" w:hAnsi="BRH Malayalam Extra" w:cs="BRH Malayalam Extra"/>
+                <w:color w:val="000000"/>
+                <w:sz w:val="40"/>
+                <w:szCs w:val="40"/>
+                <w:lang w:val="it-IT" w:eastAsia="en-IN" w:bidi="ml-IN"/>
+              </w:rPr>
+              <w:t>I |</w:t>
+            </w:r>
           </w:p>
         </w:tc>
         <w:tc>
@@ -2073,6 +2371,92 @@
               <w:autoSpaceDE w:val="0"/>
               <w:autoSpaceDN w:val="0"/>
               <w:adjustRightInd w:val="0"/>
+              <w:spacing w:line="252" w:lineRule="auto"/>
+              <w:rPr>
+                <w:rFonts w:ascii="BRH Malayalam Extra" w:eastAsia="Times New Roman" w:hAnsi="BRH Malayalam Extra" w:cs="BRH Malayalam Extra"/>
+                <w:color w:val="000000"/>
+                <w:sz w:val="40"/>
+                <w:szCs w:val="40"/>
+                <w:lang w:val="it-IT" w:eastAsia="en-IN" w:bidi="ml-IN"/>
+              </w:rPr>
+            </w:pPr>
+            <w:r>
+              <w:rPr>
+                <w:rFonts w:ascii="BRH Malayalam Extra" w:eastAsia="Times New Roman" w:hAnsi="BRH Malayalam Extra" w:cs="BRH Malayalam Extra"/>
+                <w:color w:val="000000"/>
+                <w:sz w:val="40"/>
+                <w:szCs w:val="40"/>
+                <w:lang w:val="it-IT" w:eastAsia="en-IN" w:bidi="ml-IN"/>
+              </w:rPr>
+              <w:t>Hx</w:t>
+            </w:r>
+            <w:r>
+              <w:rPr>
+                <w:rFonts w:ascii="BRH Malayalam Extra" w:eastAsia="Times New Roman" w:hAnsi="BRH Malayalam Extra" w:cs="BRH Malayalam Extra"/>
+                <w:color w:val="000000"/>
+                <w:sz w:val="32"/>
+                <w:szCs w:val="40"/>
+                <w:lang w:val="it-IT" w:eastAsia="en-IN" w:bidi="ml-IN"/>
+              </w:rPr>
+              <w:t>–</w:t>
+            </w:r>
+            <w:r>
+              <w:rPr>
+                <w:rFonts w:ascii="BRH Malayalam Extra" w:eastAsia="Times New Roman" w:hAnsi="BRH Malayalam Extra" w:cs="BRH Malayalam Extra"/>
+                <w:color w:val="000000"/>
+                <w:sz w:val="40"/>
+                <w:szCs w:val="40"/>
+                <w:lang w:val="it-IT" w:eastAsia="en-IN" w:bidi="ml-IN"/>
+              </w:rPr>
+              <w:t>¥Rx</w:t>
+            </w:r>
+            <w:r>
+              <w:rPr>
+                <w:rFonts w:ascii="BRH Malayalam Extra" w:eastAsia="Times New Roman" w:hAnsi="BRH Malayalam Extra" w:cs="BRH Malayalam Extra"/>
+                <w:color w:val="000000"/>
+                <w:sz w:val="32"/>
+                <w:szCs w:val="40"/>
+                <w:lang w:val="it-IT" w:eastAsia="en-IN" w:bidi="ml-IN"/>
+              </w:rPr>
+              <w:t>–</w:t>
+            </w:r>
+            <w:r>
+              <w:rPr>
+                <w:rFonts w:ascii="BRH Malayalam Extra" w:eastAsia="Times New Roman" w:hAnsi="BRH Malayalam Extra" w:cs="BRH Malayalam Extra"/>
+                <w:color w:val="000000"/>
+                <w:sz w:val="40"/>
+                <w:szCs w:val="40"/>
+                <w:lang w:val="it-IT" w:eastAsia="en-IN" w:bidi="ml-IN"/>
+              </w:rPr>
+              <w:t>bxhõx</w:t>
+            </w:r>
+            <w:r>
+              <w:rPr>
+                <w:rFonts w:ascii="BRH Malayalam Extra" w:eastAsia="Times New Roman" w:hAnsi="BRH Malayalam Extra" w:cs="BRH Malayalam Extra"/>
+                <w:color w:val="000000"/>
+                <w:sz w:val="32"/>
+                <w:szCs w:val="40"/>
+                <w:lang w:val="it-IT" w:eastAsia="en-IN" w:bidi="ml-IN"/>
+              </w:rPr>
+              <w:t>–</w:t>
+            </w:r>
+            <w:r>
+              <w:rPr>
+                <w:rFonts w:ascii="BRH Malayalam Extra" w:eastAsia="Times New Roman" w:hAnsi="BRH Malayalam Extra" w:cs="BRH Malayalam Extra"/>
+                <w:color w:val="000000"/>
+                <w:sz w:val="40"/>
+                <w:szCs w:val="40"/>
+                <w:lang w:val="it-IT" w:eastAsia="en-IN" w:bidi="ml-IN"/>
+              </w:rPr>
+              <w:t xml:space="preserve">i¡ræx—k¦ | </w:t>
+            </w:r>
+          </w:p>
+          <w:p>
+            <w:pPr>
+              <w:widowControl w:val="0"/>
+              <w:autoSpaceDE w:val="0"/>
+              <w:autoSpaceDN w:val="0"/>
+              <w:adjustRightInd w:val="0"/>
               <w:spacing w:before="0" w:line="240" w:lineRule="auto"/>
               <w:rPr>
                 <w:rFonts w:ascii="BRH Malayalam Extra" w:eastAsia="Times New Roman" w:hAnsi="BRH Malayalam Extra" w:cs="BRH Malayalam Extra"/>
@@ -2082,6 +2466,97 @@
                 <w:lang w:val="it-IT" w:eastAsia="en-IN" w:bidi="ml-IN"/>
               </w:rPr>
             </w:pPr>
+            <w:r>
+              <w:rPr>
+                <w:rFonts w:ascii="BRH Malayalam Extra" w:eastAsia="Times New Roman" w:hAnsi="BRH Malayalam Extra" w:cs="BRH Malayalam Extra"/>
+                <w:color w:val="000000"/>
+                <w:sz w:val="40"/>
+                <w:szCs w:val="40"/>
+                <w:lang w:val="it-IT" w:eastAsia="en-IN" w:bidi="ml-IN"/>
+              </w:rPr>
+              <w:t>Hx</w:t>
+            </w:r>
+            <w:r>
+              <w:rPr>
+                <w:rFonts w:ascii="BRH Malayalam Extra" w:eastAsia="Times New Roman" w:hAnsi="BRH Malayalam Extra" w:cs="BRH Malayalam Extra"/>
+                <w:color w:val="000000"/>
+                <w:sz w:val="32"/>
+                <w:szCs w:val="40"/>
+                <w:lang w:val="it-IT" w:eastAsia="en-IN" w:bidi="ml-IN"/>
+              </w:rPr>
+              <w:t>–</w:t>
+            </w:r>
+            <w:r>
+              <w:rPr>
+                <w:rFonts w:ascii="BRH Malayalam Extra" w:eastAsia="Times New Roman" w:hAnsi="BRH Malayalam Extra" w:cs="BRH Malayalam Extra"/>
+                <w:color w:val="000000"/>
+                <w:sz w:val="40"/>
+                <w:szCs w:val="40"/>
+                <w:lang w:val="it-IT" w:eastAsia="en-IN" w:bidi="ml-IN"/>
+              </w:rPr>
+              <w:t>¥Rx</w:t>
+            </w:r>
+            <w:r>
+              <w:rPr>
+                <w:rFonts w:ascii="BRH Malayalam Extra" w:eastAsia="Times New Roman" w:hAnsi="BRH Malayalam Extra" w:cs="BRH Malayalam Extra"/>
+                <w:color w:val="000000"/>
+                <w:sz w:val="32"/>
+                <w:szCs w:val="40"/>
+                <w:lang w:val="it-IT" w:eastAsia="en-IN" w:bidi="ml-IN"/>
+              </w:rPr>
+              <w:t>–</w:t>
+            </w:r>
+            <w:r>
+              <w:rPr>
+                <w:rFonts w:ascii="BRH Malayalam Extra" w:eastAsia="Times New Roman" w:hAnsi="BRH Malayalam Extra" w:cs="BRH Malayalam Extra"/>
+                <w:color w:val="000000"/>
+                <w:sz w:val="40"/>
+                <w:szCs w:val="40"/>
+                <w:lang w:val="it-IT" w:eastAsia="en-IN" w:bidi="ml-IN"/>
+              </w:rPr>
+              <w:t>bxhõx</w:t>
+            </w:r>
+            <w:r>
+              <w:rPr>
+                <w:rFonts w:ascii="BRH Malayalam Extra" w:eastAsia="Times New Roman" w:hAnsi="BRH Malayalam Extra" w:cs="BRH Malayalam Extra"/>
+                <w:color w:val="000000"/>
+                <w:sz w:val="32"/>
+                <w:szCs w:val="40"/>
+                <w:lang w:val="it-IT" w:eastAsia="en-IN" w:bidi="ml-IN"/>
+              </w:rPr>
+              <w:t>–</w:t>
+            </w:r>
+            <w:r>
+              <w:rPr>
+                <w:rFonts w:ascii="BRH Malayalam Extra" w:eastAsia="Times New Roman" w:hAnsi="BRH Malayalam Extra" w:cs="BRH Malayalam Extra"/>
+                <w:color w:val="000000"/>
+                <w:sz w:val="40"/>
+                <w:szCs w:val="40"/>
+                <w:lang w:val="it-IT" w:eastAsia="en-IN" w:bidi="ml-IN"/>
+              </w:rPr>
+              <w:t>iy¥Zõx—RJ - bxhõ</w:t>
+            </w:r>
+            <w:r>
+              <w:rPr>
+                <w:rFonts w:ascii="BRH Malayalam Extra" w:eastAsia="Times New Roman" w:hAnsi="BRH Malayalam Extra" w:cs="BRH Malayalam Extra"/>
+                <w:color w:val="000000"/>
+                <w:sz w:val="40"/>
+                <w:szCs w:val="40"/>
+                <w:highlight w:val="green"/>
+                <w:lang w:val="it-IT" w:eastAsia="en-IN" w:bidi="ml-IN"/>
+              </w:rPr>
+              <w:t>x˜I</w:t>
+            </w:r>
+            <w:r>
+              <w:rPr>
+                <w:rFonts w:ascii="BRH Malayalam Extra" w:eastAsia="Times New Roman" w:hAnsi="BRH Malayalam Extra" w:cs="BRH Malayalam Extra"/>
+                <w:color w:val="000000"/>
+                <w:sz w:val="40"/>
+                <w:szCs w:val="40"/>
+                <w:lang w:val="it-IT" w:eastAsia="en-IN" w:bidi="ml-IN"/>
+              </w:rPr>
+              <w:t xml:space="preserve"> |</w:t>
+            </w:r>
           </w:p>
         </w:tc>
       </w:tr>
@@ -2190,7 +2665,6 @@
         </w:rPr>
         <w:t xml:space="preserve"> Paatam – TS </w:t>
       </w:r>
-      <w:proofErr w:type="gramStart"/>
       <w:r>
         <w:rPr>
           <w:b/>
@@ -2221,7 +2695,6 @@
         </w:rPr>
         <w:t>Malayaam</w:t>
       </w:r>
-      <w:proofErr w:type="gramEnd"/>
       <w:r>
         <w:rPr>
           <w:b/>
@@ -9424,16 +9897,7 @@
           <w:bCs/>
           <w:sz w:val="32"/>
         </w:rPr>
-        <w:t xml:space="preserve">replaced </w:t>
-      </w:r>
-      <w:proofErr w:type="gramStart"/>
-      <w:r>
-        <w:rPr>
-          <w:b/>
-          <w:bCs/>
-          <w:sz w:val="32"/>
-        </w:rPr>
-        <w:t>with</w:t>
+        <w:t>replaced with</w:t>
       </w:r>
       <w:r>
         <w:rPr>
@@ -9455,7 +9919,6 @@
         </w:rPr>
         <w:t>"</w:t>
       </w:r>
-      <w:proofErr w:type="gramEnd"/>
       <w:r>
         <w:rPr>
           <w:rFonts w:ascii="BRH Malayalam" w:hAnsi="BRH Malayalam" w:cs="BRH Malayalam"/>
@@ -9467,7 +9930,6 @@
         </w:rPr>
         <w:t>q§T</w:t>
       </w:r>
-      <w:proofErr w:type="gramStart"/>
       <w:r>
         <w:rPr>
           <w:rFonts w:ascii="BRH Malayalam" w:hAnsi="BRH Malayalam" w:cs="BRH Malayalam"/>
@@ -9484,16 +9946,7 @@
           <w:bCs/>
           <w:sz w:val="32"/>
         </w:rPr>
-        <w:t>wherever</w:t>
-      </w:r>
-      <w:proofErr w:type="gramEnd"/>
-      <w:r>
-        <w:rPr>
-          <w:b/>
-          <w:bCs/>
-          <w:sz w:val="32"/>
-        </w:rPr>
-        <w:t xml:space="preserve"> applicable</w:t>
+        <w:t>wherever applicable</w:t>
       </w:r>
     </w:p>
     <w:p>

</xml_diff>